<commit_message>
Adding video link in Report
</commit_message>
<xml_diff>
--- a/reports/Heart_Disease_MLOPS_Report.docx
+++ b/reports/Heart_Disease_MLOPS_Report.docx
@@ -207,11 +207,42 @@
           <w:b/>
           <w:bCs/>
         </w:rPr>
-        <w:t>Code repository:</w:t>
-      </w:r>
-      <w:r>
+        <w:t>Video</w:t>
+      </w:r>
+      <w:r>
+        <w:rPr>
+          <w:b/>
+          <w:bCs/>
+        </w:rPr>
         <w:t xml:space="preserve"> </w:t>
       </w:r>
+      <w:proofErr w:type="gramStart"/>
+      <w:r>
+        <w:rPr>
+          <w:b/>
+          <w:bCs/>
+        </w:rPr>
+        <w:t xml:space="preserve">Link </w:t>
+      </w:r>
+      <w:r>
+        <w:rPr>
+          <w:b/>
+          <w:bCs/>
+        </w:rPr>
+        <w:t>:</w:t>
+      </w:r>
+      <w:proofErr w:type="gramEnd"/>
+      <w:r>
+        <w:t xml:space="preserve"> </w:t>
+      </w:r>
+      <w:hyperlink r:id="rId8" w:history="1">
+        <w:r>
+          <w:rPr>
+            <w:rStyle w:val="Hyperlink"/>
+          </w:rPr>
+          <w:t>https://drive.google.com/drive/folders/1fIJwsWcw_HbpQQJckL7j2BqMb7c-86d2</w:t>
+        </w:r>
+      </w:hyperlink>
     </w:p>
     <w:p>
       <w:pPr>
@@ -461,7 +492,7 @@
                     </pic:cNvPicPr>
                   </pic:nvPicPr>
                   <pic:blipFill>
-                    <a:blip r:embed="rId8"/>
+                    <a:blip r:embed="rId9"/>
                     <a:srcRect/>
                     <a:stretch>
                       <a:fillRect/>
@@ -522,12 +553,6 @@
         <w:gridCol w:w="4844"/>
       </w:tblGrid>
       <w:tr>
-        <w:tblPrEx>
-          <w:tblCellMar>
-            <w:top w:w="0" w:type="dxa"/>
-            <w:bottom w:w="0" w:type="dxa"/>
-          </w:tblCellMar>
-        </w:tblPrEx>
         <w:trPr>
           <w:tblHeader/>
         </w:trPr>
@@ -623,12 +648,6 @@
         </w:tc>
       </w:tr>
       <w:tr>
-        <w:tblPrEx>
-          <w:tblCellMar>
-            <w:top w:w="0" w:type="dxa"/>
-            <w:bottom w:w="0" w:type="dxa"/>
-          </w:tblCellMar>
-        </w:tblPrEx>
         <w:tc>
           <w:tcPr>
             <w:tcW w:w="1704" w:type="dxa"/>
@@ -785,12 +804,6 @@
         </w:tc>
       </w:tr>
       <w:tr>
-        <w:tblPrEx>
-          <w:tblCellMar>
-            <w:top w:w="0" w:type="dxa"/>
-            <w:bottom w:w="0" w:type="dxa"/>
-          </w:tblCellMar>
-        </w:tblPrEx>
         <w:tc>
           <w:tcPr>
             <w:tcW w:w="1704" w:type="dxa"/>
@@ -923,12 +936,6 @@
         </w:tc>
       </w:tr>
       <w:tr>
-        <w:tblPrEx>
-          <w:tblCellMar>
-            <w:top w:w="0" w:type="dxa"/>
-            <w:bottom w:w="0" w:type="dxa"/>
-          </w:tblCellMar>
-        </w:tblPrEx>
         <w:tc>
           <w:tcPr>
             <w:tcW w:w="1704" w:type="dxa"/>
@@ -1077,12 +1084,6 @@
         </w:tc>
       </w:tr>
       <w:tr>
-        <w:tblPrEx>
-          <w:tblCellMar>
-            <w:top w:w="0" w:type="dxa"/>
-            <w:bottom w:w="0" w:type="dxa"/>
-          </w:tblCellMar>
-        </w:tblPrEx>
         <w:tc>
           <w:tcPr>
             <w:tcW w:w="1704" w:type="dxa"/>
@@ -1249,12 +1250,6 @@
         </w:tc>
       </w:tr>
       <w:tr>
-        <w:tblPrEx>
-          <w:tblCellMar>
-            <w:top w:w="0" w:type="dxa"/>
-            <w:bottom w:w="0" w:type="dxa"/>
-          </w:tblCellMar>
-        </w:tblPrEx>
         <w:tc>
           <w:tcPr>
             <w:tcW w:w="1704" w:type="dxa"/>
@@ -1396,12 +1391,6 @@
         </w:tc>
       </w:tr>
       <w:tr>
-        <w:tblPrEx>
-          <w:tblCellMar>
-            <w:top w:w="0" w:type="dxa"/>
-            <w:bottom w:w="0" w:type="dxa"/>
-          </w:tblCellMar>
-        </w:tblPrEx>
         <w:tc>
           <w:tcPr>
             <w:tcW w:w="1704" w:type="dxa"/>
@@ -1518,12 +1507,6 @@
         </w:tc>
       </w:tr>
       <w:tr>
-        <w:tblPrEx>
-          <w:tblCellMar>
-            <w:top w:w="0" w:type="dxa"/>
-            <w:bottom w:w="0" w:type="dxa"/>
-          </w:tblCellMar>
-        </w:tblPrEx>
         <w:tc>
           <w:tcPr>
             <w:tcW w:w="1704" w:type="dxa"/>
@@ -1642,12 +1625,6 @@
         </w:tc>
       </w:tr>
       <w:tr>
-        <w:tblPrEx>
-          <w:tblCellMar>
-            <w:top w:w="0" w:type="dxa"/>
-            <w:bottom w:w="0" w:type="dxa"/>
-          </w:tblCellMar>
-        </w:tblPrEx>
         <w:tc>
           <w:tcPr>
             <w:tcW w:w="1704" w:type="dxa"/>
@@ -1785,12 +1762,6 @@
         </w:tc>
       </w:tr>
       <w:tr>
-        <w:tblPrEx>
-          <w:tblCellMar>
-            <w:top w:w="0" w:type="dxa"/>
-            <w:bottom w:w="0" w:type="dxa"/>
-          </w:tblCellMar>
-        </w:tblPrEx>
         <w:tc>
           <w:tcPr>
             <w:tcW w:w="1704" w:type="dxa"/>
@@ -2616,12 +2587,6 @@
         <w:gridCol w:w="4933"/>
       </w:tblGrid>
       <w:tr>
-        <w:tblPrEx>
-          <w:tblCellMar>
-            <w:top w:w="0" w:type="dxa"/>
-            <w:bottom w:w="0" w:type="dxa"/>
-          </w:tblCellMar>
-        </w:tblPrEx>
         <w:trPr>
           <w:cantSplit/>
         </w:trPr>
@@ -2656,89 +2621,6 @@
                   <wp:extent cx="2482670" cy="1786890"/>
                   <wp:effectExtent l="0" t="0" r="0" b="3810"/>
                   <wp:docPr id="324183562" name="01_class_balance.png" descr="Figure 2 - Class balance: 164 without disease (54%) vs 139 with disease (46%)" title="Figure 2 - Class balance: 164 without disease (54%) vs 139 with disease (46%)"/>
-                  <wp:cNvGraphicFramePr>
-                    <a:graphicFrameLocks xmlns:a="http://schemas.openxmlformats.org/drawingml/2006/main" noChangeAspect="1"/>
-                  </wp:cNvGraphicFramePr>
-                  <a:graphic xmlns:a="http://schemas.openxmlformats.org/drawingml/2006/main">
-                    <a:graphicData uri="http://schemas.openxmlformats.org/drawingml/2006/picture">
-                      <pic:pic xmlns:pic="http://schemas.openxmlformats.org/drawingml/2006/picture">
-                        <pic:nvPicPr>
-                          <pic:cNvPr id="0" name=""/>
-                          <pic:cNvPicPr>
-                            <a:picLocks noChangeAspect="1" noChangeArrowheads="1"/>
-                          </pic:cNvPicPr>
-                        </pic:nvPicPr>
-                        <pic:blipFill>
-                          <a:blip r:embed="rId9"/>
-                          <a:srcRect/>
-                          <a:stretch>
-                            <a:fillRect/>
-                          </a:stretch>
-                        </pic:blipFill>
-                        <pic:spPr bwMode="auto">
-                          <a:xfrm>
-                            <a:off x="0" y="0"/>
-                            <a:ext cx="2488440" cy="1791043"/>
-                          </a:xfrm>
-                          <a:prstGeom prst="rect">
-                            <a:avLst/>
-                          </a:prstGeom>
-                        </pic:spPr>
-                      </pic:pic>
-                    </a:graphicData>
-                  </a:graphic>
-                </wp:inline>
-              </w:drawing>
-            </w:r>
-          </w:p>
-          <w:p>
-            <w:pPr>
-              <w:spacing w:after="60"/>
-              <w:jc w:val="center"/>
-            </w:pPr>
-            <w:r>
-              <w:rPr>
-                <w:i/>
-                <w:iCs/>
-                <w:color w:val="555555"/>
-                <w:sz w:val="17"/>
-                <w:szCs w:val="17"/>
-              </w:rPr>
-              <w:t>Figure 2 - Class balance: 164 without disease (54%) vs 139 with disease (46%)</w:t>
-            </w:r>
-          </w:p>
-        </w:tc>
-        <w:tc>
-          <w:tcPr>
-            <w:tcW w:w="4933" w:type="dxa"/>
-            <w:tcBorders>
-              <w:top w:val="none" w:sz="0" w:space="0" w:color="FFFFFF"/>
-              <w:left w:val="none" w:sz="0" w:space="0" w:color="FFFFFF"/>
-              <w:bottom w:val="none" w:sz="0" w:space="0" w:color="FFFFFF"/>
-              <w:right w:val="none" w:sz="0" w:space="0" w:color="FFFFFF"/>
-            </w:tcBorders>
-            <w:tcMar>
-              <w:top w:w="0" w:type="dxa"/>
-              <w:left w:w="60" w:type="dxa"/>
-              <w:bottom w:w="0" w:type="dxa"/>
-              <w:right w:w="60" w:type="dxa"/>
-            </w:tcMar>
-          </w:tcPr>
-          <w:p>
-            <w:pPr>
-              <w:keepNext/>
-              <w:spacing w:before="40"/>
-              <w:jc w:val="center"/>
-            </w:pPr>
-            <w:r>
-              <w:rPr>
-                <w:noProof/>
-              </w:rPr>
-              <w:drawing>
-                <wp:inline distT="0" distB="0" distL="0" distR="0" wp14:anchorId="44A89338" wp14:editId="5381B7DD">
-                  <wp:extent cx="2058974" cy="1839241"/>
-                  <wp:effectExtent l="0" t="0" r="0" b="8890"/>
-                  <wp:docPr id="724206061" name="04_correlation_heatmap.png" descr="Figure 3 - Correlation heatmap of features and target" title="Figure 3 - Correlation heatmap of features and target"/>
                   <wp:cNvGraphicFramePr>
                     <a:graphicFrameLocks xmlns:a="http://schemas.openxmlformats.org/drawingml/2006/main" noChangeAspect="1"/>
                   </wp:cNvGraphicFramePr>
@@ -2761,6 +2643,89 @@
                         <pic:spPr bwMode="auto">
                           <a:xfrm>
                             <a:off x="0" y="0"/>
+                            <a:ext cx="2488440" cy="1791043"/>
+                          </a:xfrm>
+                          <a:prstGeom prst="rect">
+                            <a:avLst/>
+                          </a:prstGeom>
+                        </pic:spPr>
+                      </pic:pic>
+                    </a:graphicData>
+                  </a:graphic>
+                </wp:inline>
+              </w:drawing>
+            </w:r>
+          </w:p>
+          <w:p>
+            <w:pPr>
+              <w:spacing w:after="60"/>
+              <w:jc w:val="center"/>
+            </w:pPr>
+            <w:r>
+              <w:rPr>
+                <w:i/>
+                <w:iCs/>
+                <w:color w:val="555555"/>
+                <w:sz w:val="17"/>
+                <w:szCs w:val="17"/>
+              </w:rPr>
+              <w:t>Figure 2 - Class balance: 164 without disease (54%) vs 139 with disease (46%)</w:t>
+            </w:r>
+          </w:p>
+        </w:tc>
+        <w:tc>
+          <w:tcPr>
+            <w:tcW w:w="4933" w:type="dxa"/>
+            <w:tcBorders>
+              <w:top w:val="none" w:sz="0" w:space="0" w:color="FFFFFF"/>
+              <w:left w:val="none" w:sz="0" w:space="0" w:color="FFFFFF"/>
+              <w:bottom w:val="none" w:sz="0" w:space="0" w:color="FFFFFF"/>
+              <w:right w:val="none" w:sz="0" w:space="0" w:color="FFFFFF"/>
+            </w:tcBorders>
+            <w:tcMar>
+              <w:top w:w="0" w:type="dxa"/>
+              <w:left w:w="60" w:type="dxa"/>
+              <w:bottom w:w="0" w:type="dxa"/>
+              <w:right w:w="60" w:type="dxa"/>
+            </w:tcMar>
+          </w:tcPr>
+          <w:p>
+            <w:pPr>
+              <w:keepNext/>
+              <w:spacing w:before="40"/>
+              <w:jc w:val="center"/>
+            </w:pPr>
+            <w:r>
+              <w:rPr>
+                <w:noProof/>
+              </w:rPr>
+              <w:drawing>
+                <wp:inline distT="0" distB="0" distL="0" distR="0" wp14:anchorId="44A89338" wp14:editId="5381B7DD">
+                  <wp:extent cx="2058974" cy="1839241"/>
+                  <wp:effectExtent l="0" t="0" r="0" b="8890"/>
+                  <wp:docPr id="724206061" name="04_correlation_heatmap.png" descr="Figure 3 - Correlation heatmap of features and target" title="Figure 3 - Correlation heatmap of features and target"/>
+                  <wp:cNvGraphicFramePr>
+                    <a:graphicFrameLocks xmlns:a="http://schemas.openxmlformats.org/drawingml/2006/main" noChangeAspect="1"/>
+                  </wp:cNvGraphicFramePr>
+                  <a:graphic xmlns:a="http://schemas.openxmlformats.org/drawingml/2006/main">
+                    <a:graphicData uri="http://schemas.openxmlformats.org/drawingml/2006/picture">
+                      <pic:pic xmlns:pic="http://schemas.openxmlformats.org/drawingml/2006/picture">
+                        <pic:nvPicPr>
+                          <pic:cNvPr id="0" name=""/>
+                          <pic:cNvPicPr>
+                            <a:picLocks noChangeAspect="1" noChangeArrowheads="1"/>
+                          </pic:cNvPicPr>
+                        </pic:nvPicPr>
+                        <pic:blipFill>
+                          <a:blip r:embed="rId11"/>
+                          <a:srcRect/>
+                          <a:stretch>
+                            <a:fillRect/>
+                          </a:stretch>
+                        </pic:blipFill>
+                        <pic:spPr bwMode="auto">
+                          <a:xfrm>
+                            <a:off x="0" y="0"/>
                             <a:ext cx="2068005" cy="1847308"/>
                           </a:xfrm>
                           <a:prstGeom prst="rect">
@@ -2827,7 +2792,7 @@
                     </pic:cNvPicPr>
                   </pic:nvPicPr>
                   <pic:blipFill>
-                    <a:blip r:embed="rId11"/>
+                    <a:blip r:embed="rId12"/>
                     <a:srcRect/>
                     <a:stretch>
                       <a:fillRect/>
@@ -2893,7 +2858,7 @@
                     </pic:cNvPicPr>
                   </pic:nvPicPr>
                   <pic:blipFill>
-                    <a:blip r:embed="rId12"/>
+                    <a:blip r:embed="rId13"/>
                     <a:srcRect/>
                     <a:stretch>
                       <a:fillRect/>
@@ -2966,12 +2931,6 @@
         <w:gridCol w:w="4933"/>
       </w:tblGrid>
       <w:tr>
-        <w:tblPrEx>
-          <w:tblCellMar>
-            <w:top w:w="0" w:type="dxa"/>
-            <w:bottom w:w="0" w:type="dxa"/>
-          </w:tblCellMar>
-        </w:tblPrEx>
         <w:trPr>
           <w:tblHeader/>
         </w:trPr>
@@ -3037,12 +2996,6 @@
         </w:tc>
       </w:tr>
       <w:tr>
-        <w:tblPrEx>
-          <w:tblCellMar>
-            <w:top w:w="0" w:type="dxa"/>
-            <w:bottom w:w="0" w:type="dxa"/>
-          </w:tblCellMar>
-        </w:tblPrEx>
         <w:tc>
           <w:tcPr>
             <w:tcW w:w="4933" w:type="dxa"/>
@@ -3115,12 +3068,6 @@
         </w:tc>
       </w:tr>
       <w:tr>
-        <w:tblPrEx>
-          <w:tblCellMar>
-            <w:top w:w="0" w:type="dxa"/>
-            <w:bottom w:w="0" w:type="dxa"/>
-          </w:tblCellMar>
-        </w:tblPrEx>
         <w:tc>
           <w:tcPr>
             <w:tcW w:w="4933" w:type="dxa"/>
@@ -3297,12 +3244,6 @@
         </w:tc>
       </w:tr>
       <w:tr>
-        <w:tblPrEx>
-          <w:tblCellMar>
-            <w:top w:w="0" w:type="dxa"/>
-            <w:bottom w:w="0" w:type="dxa"/>
-          </w:tblCellMar>
-        </w:tblPrEx>
         <w:tc>
           <w:tcPr>
             <w:tcW w:w="4933" w:type="dxa"/>
@@ -3418,12 +3359,6 @@
         </w:tc>
       </w:tr>
       <w:tr>
-        <w:tblPrEx>
-          <w:tblCellMar>
-            <w:top w:w="0" w:type="dxa"/>
-            <w:bottom w:w="0" w:type="dxa"/>
-          </w:tblCellMar>
-        </w:tblPrEx>
         <w:tc>
           <w:tcPr>
             <w:tcW w:w="4933" w:type="dxa"/>
@@ -3531,12 +3466,6 @@
         </w:tc>
       </w:tr>
       <w:tr>
-        <w:tblPrEx>
-          <w:tblCellMar>
-            <w:top w:w="0" w:type="dxa"/>
-            <w:bottom w:w="0" w:type="dxa"/>
-          </w:tblCellMar>
-        </w:tblPrEx>
         <w:tc>
           <w:tcPr>
             <w:tcW w:w="4933" w:type="dxa"/>
@@ -3609,12 +3538,6 @@
         </w:tc>
       </w:tr>
       <w:tr>
-        <w:tblPrEx>
-          <w:tblCellMar>
-            <w:top w:w="0" w:type="dxa"/>
-            <w:bottom w:w="0" w:type="dxa"/>
-          </w:tblCellMar>
-        </w:tblPrEx>
         <w:tc>
           <w:tcPr>
             <w:tcW w:w="4933" w:type="dxa"/>
@@ -4269,12 +4192,6 @@
         <w:gridCol w:w="3056"/>
       </w:tblGrid>
       <w:tr>
-        <w:tblPrEx>
-          <w:tblCellMar>
-            <w:top w:w="0" w:type="dxa"/>
-            <w:bottom w:w="0" w:type="dxa"/>
-          </w:tblCellMar>
-        </w:tblPrEx>
         <w:trPr>
           <w:trHeight w:val="155"/>
           <w:tblHeader/>
@@ -4425,12 +4342,6 @@
         </w:tc>
       </w:tr>
       <w:tr>
-        <w:tblPrEx>
-          <w:tblCellMar>
-            <w:top w:w="0" w:type="dxa"/>
-            <w:bottom w:w="0" w:type="dxa"/>
-          </w:tblCellMar>
-        </w:tblPrEx>
         <w:trPr>
           <w:trHeight w:val="322"/>
         </w:trPr>
@@ -4596,12 +4507,6 @@
         </w:tc>
       </w:tr>
       <w:tr>
-        <w:tblPrEx>
-          <w:tblCellMar>
-            <w:top w:w="0" w:type="dxa"/>
-            <w:bottom w:w="0" w:type="dxa"/>
-          </w:tblCellMar>
-        </w:tblPrEx>
         <w:trPr>
           <w:trHeight w:val="332"/>
         </w:trPr>
@@ -4812,12 +4717,6 @@
         </w:tc>
       </w:tr>
       <w:tr>
-        <w:tblPrEx>
-          <w:tblCellMar>
-            <w:top w:w="0" w:type="dxa"/>
-            <w:bottom w:w="0" w:type="dxa"/>
-          </w:tblCellMar>
-        </w:tblPrEx>
         <w:trPr>
           <w:trHeight w:val="488"/>
         </w:trPr>
@@ -5062,12 +4961,6 @@
         <w:gridCol w:w="1112"/>
       </w:tblGrid>
       <w:tr>
-        <w:tblPrEx>
-          <w:tblCellMar>
-            <w:top w:w="0" w:type="dxa"/>
-            <w:bottom w:w="0" w:type="dxa"/>
-          </w:tblCellMar>
-        </w:tblPrEx>
         <w:trPr>
           <w:tblHeader/>
         </w:trPr>
@@ -5451,12 +5344,6 @@
         </w:tc>
       </w:tr>
       <w:tr>
-        <w:tblPrEx>
-          <w:tblCellMar>
-            <w:top w:w="0" w:type="dxa"/>
-            <w:bottom w:w="0" w:type="dxa"/>
-          </w:tblCellMar>
-        </w:tblPrEx>
         <w:tc>
           <w:tcPr>
             <w:tcW w:w="1751" w:type="dxa"/>
@@ -5759,12 +5646,6 @@
         </w:tc>
       </w:tr>
       <w:tr>
-        <w:tblPrEx>
-          <w:tblCellMar>
-            <w:top w:w="0" w:type="dxa"/>
-            <w:bottom w:w="0" w:type="dxa"/>
-          </w:tblCellMar>
-        </w:tblPrEx>
         <w:tc>
           <w:tcPr>
             <w:tcW w:w="1751" w:type="dxa"/>
@@ -6064,12 +5945,6 @@
         </w:tc>
       </w:tr>
       <w:tr>
-        <w:tblPrEx>
-          <w:tblCellMar>
-            <w:top w:w="0" w:type="dxa"/>
-            <w:bottom w:w="0" w:type="dxa"/>
-          </w:tblCellMar>
-        </w:tblPrEx>
         <w:tc>
           <w:tcPr>
             <w:tcW w:w="1751" w:type="dxa"/>
@@ -6387,12 +6262,6 @@
         <w:gridCol w:w="4933"/>
       </w:tblGrid>
       <w:tr>
-        <w:tblPrEx>
-          <w:tblCellMar>
-            <w:top w:w="0" w:type="dxa"/>
-            <w:bottom w:w="0" w:type="dxa"/>
-          </w:tblCellMar>
-        </w:tblPrEx>
         <w:trPr>
           <w:cantSplit/>
         </w:trPr>
@@ -6440,7 +6309,7 @@
                           </pic:cNvPicPr>
                         </pic:nvPicPr>
                         <pic:blipFill>
-                          <a:blip r:embed="rId13"/>
+                          <a:blip r:embed="rId14"/>
                           <a:srcRect/>
                           <a:stretch>
                             <a:fillRect/>
@@ -6523,7 +6392,7 @@
                           </pic:cNvPicPr>
                         </pic:nvPicPr>
                         <pic:blipFill>
-                          <a:blip r:embed="rId14"/>
+                          <a:blip r:embed="rId15"/>
                           <a:srcRect/>
                           <a:stretch>
                             <a:fillRect/>
@@ -6748,12 +6617,6 @@
         <w:gridCol w:w="4933"/>
       </w:tblGrid>
       <w:tr>
-        <w:tblPrEx>
-          <w:tblCellMar>
-            <w:top w:w="0" w:type="dxa"/>
-            <w:bottom w:w="0" w:type="dxa"/>
-          </w:tblCellMar>
-        </w:tblPrEx>
         <w:trPr>
           <w:cantSplit/>
         </w:trPr>
@@ -6801,7 +6664,7 @@
                           </pic:cNvPicPr>
                         </pic:nvPicPr>
                         <pic:blipFill>
-                          <a:blip r:embed="rId15"/>
+                          <a:blip r:embed="rId16"/>
                           <a:srcRect/>
                           <a:stretch>
                             <a:fillRect/>
@@ -6884,7 +6747,7 @@
                           </pic:cNvPicPr>
                         </pic:nvPicPr>
                         <pic:blipFill>
-                          <a:blip r:embed="rId16"/>
+                          <a:blip r:embed="rId17"/>
                           <a:srcRect/>
                           <a:stretch>
                             <a:fillRect/>
@@ -7258,12 +7121,6 @@
         <w:gridCol w:w="4706"/>
       </w:tblGrid>
       <w:tr>
-        <w:tblPrEx>
-          <w:tblCellMar>
-            <w:top w:w="0" w:type="dxa"/>
-            <w:bottom w:w="0" w:type="dxa"/>
-          </w:tblCellMar>
-        </w:tblPrEx>
         <w:trPr>
           <w:cantSplit/>
         </w:trPr>
@@ -7311,7 +7168,7 @@
                           </pic:cNvPicPr>
                         </pic:nvPicPr>
                         <pic:blipFill>
-                          <a:blip r:embed="rId17" cstate="print">
+                          <a:blip r:embed="rId18" cstate="print">
                             <a:extLst>
                               <a:ext uri="{28A0092B-C50C-407E-A947-70E740481C1C}">
                                 <a14:useLocalDpi xmlns:a14="http://schemas.microsoft.com/office/drawing/2010/main" val="0"/>
@@ -7426,7 +7283,7 @@
                           </pic:cNvPicPr>
                         </pic:nvPicPr>
                         <pic:blipFill>
-                          <a:blip r:embed="rId18" cstate="print">
+                          <a:blip r:embed="rId19" cstate="print">
                             <a:extLst>
                               <a:ext uri="{28A0092B-C50C-407E-A947-70E740481C1C}">
                                 <a14:useLocalDpi xmlns:a14="http://schemas.microsoft.com/office/drawing/2010/main" val="0"/>
@@ -7526,12 +7383,6 @@
         <w:gridCol w:w="4988"/>
       </w:tblGrid>
       <w:tr>
-        <w:tblPrEx>
-          <w:tblCellMar>
-            <w:top w:w="0" w:type="dxa"/>
-            <w:bottom w:w="0" w:type="dxa"/>
-          </w:tblCellMar>
-        </w:tblPrEx>
         <w:trPr>
           <w:cantSplit/>
         </w:trPr>
@@ -7579,7 +7430,7 @@
                           </pic:cNvPicPr>
                         </pic:nvPicPr>
                         <pic:blipFill>
-                          <a:blip r:embed="rId19" cstate="print">
+                          <a:blip r:embed="rId20" cstate="print">
                             <a:extLst>
                               <a:ext uri="{28A0092B-C50C-407E-A947-70E740481C1C}">
                                 <a14:useLocalDpi xmlns:a14="http://schemas.microsoft.com/office/drawing/2010/main" val="0"/>
@@ -7672,7 +7523,7 @@
                           </pic:cNvPicPr>
                         </pic:nvPicPr>
                         <pic:blipFill>
-                          <a:blip r:embed="rId20" cstate="print">
+                          <a:blip r:embed="rId21" cstate="print">
                             <a:extLst>
                               <a:ext uri="{28A0092B-C50C-407E-A947-70E740481C1C}">
                                 <a14:useLocalDpi xmlns:a14="http://schemas.microsoft.com/office/drawing/2010/main" val="0"/>
@@ -7757,7 +7608,7 @@
                     </pic:cNvPicPr>
                   </pic:nvPicPr>
                   <pic:blipFill>
-                    <a:blip r:embed="rId21" cstate="print">
+                    <a:blip r:embed="rId22" cstate="print">
                       <a:extLst>
                         <a:ext uri="{28A0092B-C50C-407E-A947-70E740481C1C}">
                           <a14:useLocalDpi xmlns:a14="http://schemas.microsoft.com/office/drawing/2010/main" val="0"/>
@@ -7857,12 +7708,6 @@
         <w:gridCol w:w="5861"/>
       </w:tblGrid>
       <w:tr>
-        <w:tblPrEx>
-          <w:tblCellMar>
-            <w:top w:w="0" w:type="dxa"/>
-            <w:bottom w:w="0" w:type="dxa"/>
-          </w:tblCellMar>
-        </w:tblPrEx>
         <w:trPr>
           <w:tblHeader/>
         </w:trPr>
@@ -7928,12 +7773,6 @@
         </w:tc>
       </w:tr>
       <w:tr>
-        <w:tblPrEx>
-          <w:tblCellMar>
-            <w:top w:w="0" w:type="dxa"/>
-            <w:bottom w:w="0" w:type="dxa"/>
-          </w:tblCellMar>
-        </w:tblPrEx>
         <w:tc>
           <w:tcPr>
             <w:tcW w:w="4005" w:type="dxa"/>
@@ -8017,12 +7856,6 @@
         </w:tc>
       </w:tr>
       <w:tr>
-        <w:tblPrEx>
-          <w:tblCellMar>
-            <w:top w:w="0" w:type="dxa"/>
-            <w:bottom w:w="0" w:type="dxa"/>
-          </w:tblCellMar>
-        </w:tblPrEx>
         <w:tc>
           <w:tcPr>
             <w:tcW w:w="4005" w:type="dxa"/>
@@ -8124,12 +7957,6 @@
         </w:tc>
       </w:tr>
       <w:tr>
-        <w:tblPrEx>
-          <w:tblCellMar>
-            <w:top w:w="0" w:type="dxa"/>
-            <w:bottom w:w="0" w:type="dxa"/>
-          </w:tblCellMar>
-        </w:tblPrEx>
         <w:tc>
           <w:tcPr>
             <w:tcW w:w="4005" w:type="dxa"/>
@@ -8336,12 +8163,6 @@
         </w:tc>
       </w:tr>
       <w:tr>
-        <w:tblPrEx>
-          <w:tblCellMar>
-            <w:top w:w="0" w:type="dxa"/>
-            <w:bottom w:w="0" w:type="dxa"/>
-          </w:tblCellMar>
-        </w:tblPrEx>
         <w:tc>
           <w:tcPr>
             <w:tcW w:w="4005" w:type="dxa"/>
@@ -8683,12 +8504,6 @@
         <w:gridCol w:w="7893"/>
       </w:tblGrid>
       <w:tr>
-        <w:tblPrEx>
-          <w:tblCellMar>
-            <w:top w:w="0" w:type="dxa"/>
-            <w:bottom w:w="0" w:type="dxa"/>
-          </w:tblCellMar>
-        </w:tblPrEx>
         <w:trPr>
           <w:tblHeader/>
         </w:trPr>
@@ -8754,12 +8569,6 @@
         </w:tc>
       </w:tr>
       <w:tr>
-        <w:tblPrEx>
-          <w:tblCellMar>
-            <w:top w:w="0" w:type="dxa"/>
-            <w:bottom w:w="0" w:type="dxa"/>
-          </w:tblCellMar>
-        </w:tblPrEx>
         <w:tc>
           <w:tcPr>
             <w:tcW w:w="1973" w:type="dxa"/>
@@ -8882,12 +8691,6 @@
         </w:tc>
       </w:tr>
       <w:tr>
-        <w:tblPrEx>
-          <w:tblCellMar>
-            <w:top w:w="0" w:type="dxa"/>
-            <w:bottom w:w="0" w:type="dxa"/>
-          </w:tblCellMar>
-        </w:tblPrEx>
         <w:tc>
           <w:tcPr>
             <w:tcW w:w="1973" w:type="dxa"/>
@@ -8962,12 +8765,6 @@
         </w:tc>
       </w:tr>
       <w:tr>
-        <w:tblPrEx>
-          <w:tblCellMar>
-            <w:top w:w="0" w:type="dxa"/>
-            <w:bottom w:w="0" w:type="dxa"/>
-          </w:tblCellMar>
-        </w:tblPrEx>
         <w:tc>
           <w:tcPr>
             <w:tcW w:w="1973" w:type="dxa"/>
@@ -9035,12 +8832,6 @@
         </w:tc>
       </w:tr>
       <w:tr>
-        <w:tblPrEx>
-          <w:tblCellMar>
-            <w:top w:w="0" w:type="dxa"/>
-            <w:bottom w:w="0" w:type="dxa"/>
-          </w:tblCellMar>
-        </w:tblPrEx>
         <w:tc>
           <w:tcPr>
             <w:tcW w:w="1973" w:type="dxa"/>
@@ -9108,12 +8899,6 @@
         </w:tc>
       </w:tr>
       <w:tr>
-        <w:tblPrEx>
-          <w:tblCellMar>
-            <w:top w:w="0" w:type="dxa"/>
-            <w:bottom w:w="0" w:type="dxa"/>
-          </w:tblCellMar>
-        </w:tblPrEx>
         <w:tc>
           <w:tcPr>
             <w:tcW w:w="1973" w:type="dxa"/>
@@ -9650,12 +9435,6 @@
         <w:gridCol w:w="6802"/>
       </w:tblGrid>
       <w:tr>
-        <w:tblPrEx>
-          <w:tblCellMar>
-            <w:top w:w="0" w:type="dxa"/>
-            <w:bottom w:w="0" w:type="dxa"/>
-          </w:tblCellMar>
-        </w:tblPrEx>
         <w:trPr>
           <w:cantSplit/>
         </w:trPr>
@@ -9703,7 +9482,7 @@
                           </pic:cNvPicPr>
                         </pic:nvPicPr>
                         <pic:blipFill>
-                          <a:blip r:embed="rId22"/>
+                          <a:blip r:embed="rId23"/>
                           <a:srcRect/>
                           <a:stretch>
                             <a:fillRect/>
@@ -9805,7 +9584,7 @@
                           </pic:cNvPicPr>
                         </pic:nvPicPr>
                         <pic:blipFill>
-                          <a:blip r:embed="rId23" cstate="print">
+                          <a:blip r:embed="rId24" cstate="print">
                             <a:extLst>
                               <a:ext uri="{28A0092B-C50C-407E-A947-70E740481C1C}">
                                 <a14:useLocalDpi xmlns:a14="http://schemas.microsoft.com/office/drawing/2010/main" val="0"/>
@@ -10971,12 +10750,6 @@
         <w:gridCol w:w="8000"/>
       </w:tblGrid>
       <w:tr>
-        <w:tblPrEx>
-          <w:tblCellMar>
-            <w:top w:w="0" w:type="dxa"/>
-            <w:bottom w:w="0" w:type="dxa"/>
-          </w:tblCellMar>
-        </w:tblPrEx>
         <w:trPr>
           <w:tblHeader/>
         </w:trPr>
@@ -11042,12 +10815,6 @@
         </w:tc>
       </w:tr>
       <w:tr>
-        <w:tblPrEx>
-          <w:tblCellMar>
-            <w:top w:w="0" w:type="dxa"/>
-            <w:bottom w:w="0" w:type="dxa"/>
-          </w:tblCellMar>
-        </w:tblPrEx>
         <w:tc>
           <w:tcPr>
             <w:tcW w:w="1866" w:type="dxa"/>
@@ -11140,12 +10907,6 @@
         </w:tc>
       </w:tr>
       <w:tr>
-        <w:tblPrEx>
-          <w:tblCellMar>
-            <w:top w:w="0" w:type="dxa"/>
-            <w:bottom w:w="0" w:type="dxa"/>
-          </w:tblCellMar>
-        </w:tblPrEx>
         <w:tc>
           <w:tcPr>
             <w:tcW w:w="1866" w:type="dxa"/>
@@ -11275,12 +11036,6 @@
         </w:tc>
       </w:tr>
       <w:tr>
-        <w:tblPrEx>
-          <w:tblCellMar>
-            <w:top w:w="0" w:type="dxa"/>
-            <w:bottom w:w="0" w:type="dxa"/>
-          </w:tblCellMar>
-        </w:tblPrEx>
         <w:tc>
           <w:tcPr>
             <w:tcW w:w="1866" w:type="dxa"/>
@@ -11420,12 +11175,6 @@
         <w:gridCol w:w="5125"/>
       </w:tblGrid>
       <w:tr>
-        <w:tblPrEx>
-          <w:tblCellMar>
-            <w:top w:w="0" w:type="dxa"/>
-            <w:bottom w:w="0" w:type="dxa"/>
-          </w:tblCellMar>
-        </w:tblPrEx>
         <w:trPr>
           <w:cantSplit/>
         </w:trPr>
@@ -11473,7 +11222,7 @@
                           </pic:cNvPicPr>
                         </pic:nvPicPr>
                         <pic:blipFill>
-                          <a:blip r:embed="rId24" cstate="print">
+                          <a:blip r:embed="rId25" cstate="print">
                             <a:extLst>
                               <a:ext uri="{28A0092B-C50C-407E-A947-70E740481C1C}">
                                 <a14:useLocalDpi xmlns:a14="http://schemas.microsoft.com/office/drawing/2010/main" val="0"/>
@@ -11566,7 +11315,7 @@
                           </pic:cNvPicPr>
                         </pic:nvPicPr>
                         <pic:blipFill>
-                          <a:blip r:embed="rId25" cstate="print">
+                          <a:blip r:embed="rId26" cstate="print">
                             <a:extLst>
                               <a:ext uri="{28A0092B-C50C-407E-A947-70E740481C1C}">
                                 <a14:useLocalDpi xmlns:a14="http://schemas.microsoft.com/office/drawing/2010/main" val="0"/>
@@ -11644,12 +11393,6 @@
         <w:gridCol w:w="4586"/>
       </w:tblGrid>
       <w:tr>
-        <w:tblPrEx>
-          <w:tblCellMar>
-            <w:top w:w="0" w:type="dxa"/>
-            <w:bottom w:w="0" w:type="dxa"/>
-          </w:tblCellMar>
-        </w:tblPrEx>
         <w:trPr>
           <w:cantSplit/>
         </w:trPr>
@@ -11703,7 +11446,7 @@
                           </pic:cNvPicPr>
                         </pic:nvPicPr>
                         <pic:blipFill>
-                          <a:blip r:embed="rId26" cstate="print">
+                          <a:blip r:embed="rId27" cstate="print">
                             <a:extLst>
                               <a:ext uri="{28A0092B-C50C-407E-A947-70E740481C1C}">
                                 <a14:useLocalDpi xmlns:a14="http://schemas.microsoft.com/office/drawing/2010/main" val="0"/>
@@ -11795,7 +11538,7 @@
                           </pic:cNvPicPr>
                         </pic:nvPicPr>
                         <pic:blipFill>
-                          <a:blip r:embed="rId27" cstate="print">
+                          <a:blip r:embed="rId28" cstate="print">
                             <a:extLst>
                               <a:ext uri="{28A0092B-C50C-407E-A947-70E740481C1C}">
                                 <a14:useLocalDpi xmlns:a14="http://schemas.microsoft.com/office/drawing/2010/main" val="0"/>
@@ -11947,7 +11690,7 @@
                     </pic:cNvPicPr>
                   </pic:nvPicPr>
                   <pic:blipFill>
-                    <a:blip r:embed="rId28" cstate="print">
+                    <a:blip r:embed="rId29" cstate="print">
                       <a:extLst>
                         <a:ext uri="{28A0092B-C50C-407E-A947-70E740481C1C}">
                           <a14:useLocalDpi xmlns:a14="http://schemas.microsoft.com/office/drawing/2010/main" val="0"/>
@@ -12170,12 +11913,6 @@
         <w:gridCol w:w="2467"/>
       </w:tblGrid>
       <w:tr>
-        <w:tblPrEx>
-          <w:tblCellMar>
-            <w:top w:w="0" w:type="dxa"/>
-            <w:bottom w:w="0" w:type="dxa"/>
-          </w:tblCellMar>
-        </w:tblPrEx>
         <w:trPr>
           <w:tblHeader/>
         </w:trPr>
@@ -12241,12 +11978,6 @@
         </w:tc>
       </w:tr>
       <w:tr>
-        <w:tblPrEx>
-          <w:tblCellMar>
-            <w:top w:w="0" w:type="dxa"/>
-            <w:bottom w:w="0" w:type="dxa"/>
-          </w:tblCellMar>
-        </w:tblPrEx>
         <w:tc>
           <w:tcPr>
             <w:tcW w:w="7399" w:type="dxa"/>
@@ -12345,12 +12076,6 @@
         </w:tc>
       </w:tr>
       <w:tr>
-        <w:tblPrEx>
-          <w:tblCellMar>
-            <w:top w:w="0" w:type="dxa"/>
-            <w:bottom w:w="0" w:type="dxa"/>
-          </w:tblCellMar>
-        </w:tblPrEx>
         <w:tc>
           <w:tcPr>
             <w:tcW w:w="7399" w:type="dxa"/>
@@ -12411,12 +12136,6 @@
         </w:tc>
       </w:tr>
       <w:tr>
-        <w:tblPrEx>
-          <w:tblCellMar>
-            <w:top w:w="0" w:type="dxa"/>
-            <w:bottom w:w="0" w:type="dxa"/>
-          </w:tblCellMar>
-        </w:tblPrEx>
         <w:tc>
           <w:tcPr>
             <w:tcW w:w="7399" w:type="dxa"/>
@@ -12475,12 +12194,6 @@
         </w:tc>
       </w:tr>
       <w:tr>
-        <w:tblPrEx>
-          <w:tblCellMar>
-            <w:top w:w="0" w:type="dxa"/>
-            <w:bottom w:w="0" w:type="dxa"/>
-          </w:tblCellMar>
-        </w:tblPrEx>
         <w:tc>
           <w:tcPr>
             <w:tcW w:w="7399" w:type="dxa"/>
@@ -12550,12 +12263,6 @@
         </w:tc>
       </w:tr>
       <w:tr>
-        <w:tblPrEx>
-          <w:tblCellMar>
-            <w:top w:w="0" w:type="dxa"/>
-            <w:bottom w:w="0" w:type="dxa"/>
-          </w:tblCellMar>
-        </w:tblPrEx>
         <w:tc>
           <w:tcPr>
             <w:tcW w:w="7399" w:type="dxa"/>
@@ -12614,12 +12321,6 @@
         </w:tc>
       </w:tr>
       <w:tr>
-        <w:tblPrEx>
-          <w:tblCellMar>
-            <w:top w:w="0" w:type="dxa"/>
-            <w:bottom w:w="0" w:type="dxa"/>
-          </w:tblCellMar>
-        </w:tblPrEx>
         <w:tc>
           <w:tcPr>
             <w:tcW w:w="7399" w:type="dxa"/>
@@ -12843,12 +12544,6 @@
         <w:gridCol w:w="4846"/>
       </w:tblGrid>
       <w:tr>
-        <w:tblPrEx>
-          <w:tblCellMar>
-            <w:top w:w="0" w:type="dxa"/>
-            <w:bottom w:w="0" w:type="dxa"/>
-          </w:tblCellMar>
-        </w:tblPrEx>
         <w:trPr>
           <w:cantSplit/>
         </w:trPr>
@@ -12896,7 +12591,7 @@
                           </pic:cNvPicPr>
                         </pic:nvPicPr>
                         <pic:blipFill>
-                          <a:blip r:embed="rId29"/>
+                          <a:blip r:embed="rId30"/>
                           <a:srcRect/>
                           <a:stretch>
                             <a:fillRect/>
@@ -12983,7 +12678,7 @@
                           </pic:cNvPicPr>
                         </pic:nvPicPr>
                         <pic:blipFill>
-                          <a:blip r:embed="rId30" cstate="print">
+                          <a:blip r:embed="rId31" cstate="print">
                             <a:extLst>
                               <a:ext uri="{28A0092B-C50C-407E-A947-70E740481C1C}">
                                 <a14:useLocalDpi xmlns:a14="http://schemas.microsoft.com/office/drawing/2010/main" val="0"/>
@@ -13034,12 +12729,6 @@
         </w:tc>
       </w:tr>
       <w:tr>
-        <w:tblPrEx>
-          <w:tblCellMar>
-            <w:top w:w="0" w:type="dxa"/>
-            <w:bottom w:w="0" w:type="dxa"/>
-          </w:tblCellMar>
-        </w:tblPrEx>
         <w:trPr>
           <w:cantSplit/>
         </w:trPr>
@@ -13100,7 +12789,7 @@
                           </pic:cNvPicPr>
                         </pic:nvPicPr>
                         <pic:blipFill>
-                          <a:blip r:embed="rId31" cstate="print">
+                          <a:blip r:embed="rId32" cstate="print">
                             <a:extLst>
                               <a:ext uri="{28A0092B-C50C-407E-A947-70E740481C1C}">
                                 <a14:useLocalDpi xmlns:a14="http://schemas.microsoft.com/office/drawing/2010/main" val="0"/>
@@ -13162,67 +12851,7 @@
                 <w:sz w:val="17"/>
                 <w:szCs w:val="17"/>
               </w:rPr>
-              <w:t>Figure 2</w:t>
-            </w:r>
-            <w:r>
-              <w:rPr>
-                <w:i/>
-                <w:iCs/>
-                <w:color w:val="555555"/>
-                <w:sz w:val="17"/>
-                <w:szCs w:val="17"/>
-              </w:rPr>
-              <w:t>5</w:t>
-            </w:r>
-            <w:r>
-              <w:rPr>
-                <w:i/>
-                <w:iCs/>
-                <w:color w:val="555555"/>
-                <w:sz w:val="17"/>
-                <w:szCs w:val="17"/>
-              </w:rPr>
-              <w:t xml:space="preserve"> </w:t>
-            </w:r>
-            <w:r>
-              <w:rPr>
-                <w:i/>
-                <w:iCs/>
-                <w:color w:val="555555"/>
-                <w:sz w:val="17"/>
-                <w:szCs w:val="17"/>
-              </w:rPr>
-              <w:t>–</w:t>
-            </w:r>
-            <w:r>
-              <w:rPr>
-                <w:i/>
-                <w:iCs/>
-                <w:color w:val="555555"/>
-                <w:sz w:val="17"/>
-                <w:szCs w:val="17"/>
-              </w:rPr>
-              <w:t xml:space="preserve"> </w:t>
-            </w:r>
-            <w:r>
-              <w:rPr>
-                <w:i/>
-                <w:iCs/>
-                <w:color w:val="555555"/>
-                <w:sz w:val="17"/>
-                <w:szCs w:val="17"/>
-              </w:rPr>
-              <w:t xml:space="preserve">Different </w:t>
-            </w:r>
-            <w:r>
-              <w:rPr>
-                <w:i/>
-                <w:iCs/>
-                <w:color w:val="555555"/>
-                <w:sz w:val="17"/>
-                <w:szCs w:val="17"/>
-              </w:rPr>
-              <w:t xml:space="preserve">Prometheus metrics exposed </w:t>
+              <w:t xml:space="preserve">Figure 25 – Different Prometheus metrics exposed </w:t>
             </w:r>
           </w:p>
         </w:tc>
@@ -13281,7 +12910,7 @@
                           </pic:cNvPicPr>
                         </pic:nvPicPr>
                         <pic:blipFill>
-                          <a:blip r:embed="rId32" cstate="print">
+                          <a:blip r:embed="rId33" cstate="print">
                             <a:extLst>
                               <a:ext uri="{28A0092B-C50C-407E-A947-70E740481C1C}">
                                 <a14:useLocalDpi xmlns:a14="http://schemas.microsoft.com/office/drawing/2010/main" val="0"/>
@@ -13338,37 +12967,7 @@
                 <w:sz w:val="17"/>
                 <w:szCs w:val="17"/>
               </w:rPr>
-              <w:t>Figure 2</w:t>
-            </w:r>
-            <w:r>
-              <w:rPr>
-                <w:i/>
-                <w:iCs/>
-                <w:color w:val="555555"/>
-                <w:sz w:val="17"/>
-                <w:szCs w:val="17"/>
-              </w:rPr>
-              <w:t>6</w:t>
-            </w:r>
-            <w:r>
-              <w:rPr>
-                <w:i/>
-                <w:iCs/>
-                <w:color w:val="555555"/>
-                <w:sz w:val="17"/>
-                <w:szCs w:val="17"/>
-              </w:rPr>
-              <w:t xml:space="preserve"> - Prometheus metrics exposed by the API after generated traffic</w:t>
-            </w:r>
-            <w:r>
-              <w:rPr>
-                <w:i/>
-                <w:iCs/>
-                <w:color w:val="555555"/>
-                <w:sz w:val="17"/>
-                <w:szCs w:val="17"/>
-              </w:rPr>
-              <w:t xml:space="preserve"> in </w:t>
+              <w:t xml:space="preserve">Figure 26 - Prometheus metrics exposed by the API after generated traffic in </w:t>
             </w:r>
             <w:proofErr w:type="spellStart"/>
             <w:r>
@@ -13563,12 +13162,6 @@
         <w:gridCol w:w="6167"/>
       </w:tblGrid>
       <w:tr>
-        <w:tblPrEx>
-          <w:tblCellMar>
-            <w:top w:w="0" w:type="dxa"/>
-            <w:bottom w:w="0" w:type="dxa"/>
-          </w:tblCellMar>
-        </w:tblPrEx>
         <w:trPr>
           <w:tblHeader/>
         </w:trPr>
@@ -13634,12 +13227,6 @@
         </w:tc>
       </w:tr>
       <w:tr>
-        <w:tblPrEx>
-          <w:tblCellMar>
-            <w:top w:w="0" w:type="dxa"/>
-            <w:bottom w:w="0" w:type="dxa"/>
-          </w:tblCellMar>
-        </w:tblPrEx>
         <w:tc>
           <w:tcPr>
             <w:tcW w:w="3699" w:type="dxa"/>
@@ -13800,12 +13387,6 @@
         </w:tc>
       </w:tr>
       <w:tr>
-        <w:tblPrEx>
-          <w:tblCellMar>
-            <w:top w:w="0" w:type="dxa"/>
-            <w:bottom w:w="0" w:type="dxa"/>
-          </w:tblCellMar>
-        </w:tblPrEx>
         <w:tc>
           <w:tcPr>
             <w:tcW w:w="3699" w:type="dxa"/>
@@ -13880,12 +13461,6 @@
         </w:tc>
       </w:tr>
       <w:tr>
-        <w:tblPrEx>
-          <w:tblCellMar>
-            <w:top w:w="0" w:type="dxa"/>
-            <w:bottom w:w="0" w:type="dxa"/>
-          </w:tblCellMar>
-        </w:tblPrEx>
         <w:tc>
           <w:tcPr>
             <w:tcW w:w="3699" w:type="dxa"/>
@@ -13996,12 +13571,6 @@
         </w:tc>
       </w:tr>
       <w:tr>
-        <w:tblPrEx>
-          <w:tblCellMar>
-            <w:top w:w="0" w:type="dxa"/>
-            <w:bottom w:w="0" w:type="dxa"/>
-          </w:tblCellMar>
-        </w:tblPrEx>
         <w:tc>
           <w:tcPr>
             <w:tcW w:w="3699" w:type="dxa"/>
@@ -14067,12 +13636,6 @@
         </w:tc>
       </w:tr>
       <w:tr>
-        <w:tblPrEx>
-          <w:tblCellMar>
-            <w:top w:w="0" w:type="dxa"/>
-            <w:bottom w:w="0" w:type="dxa"/>
-          </w:tblCellMar>
-        </w:tblPrEx>
         <w:tc>
           <w:tcPr>
             <w:tcW w:w="3699" w:type="dxa"/>
@@ -14160,12 +13723,6 @@
         </w:tc>
       </w:tr>
       <w:tr>
-        <w:tblPrEx>
-          <w:tblCellMar>
-            <w:top w:w="0" w:type="dxa"/>
-            <w:bottom w:w="0" w:type="dxa"/>
-          </w:tblCellMar>
-        </w:tblPrEx>
         <w:tc>
           <w:tcPr>
             <w:tcW w:w="3699" w:type="dxa"/>
@@ -14240,12 +13797,6 @@
         </w:tc>
       </w:tr>
       <w:tr>
-        <w:tblPrEx>
-          <w:tblCellMar>
-            <w:top w:w="0" w:type="dxa"/>
-            <w:bottom w:w="0" w:type="dxa"/>
-          </w:tblCellMar>
-        </w:tblPrEx>
         <w:tc>
           <w:tcPr>
             <w:tcW w:w="3699" w:type="dxa"/>
@@ -14309,12 +13860,6 @@
         </w:tc>
       </w:tr>
       <w:tr>
-        <w:tblPrEx>
-          <w:tblCellMar>
-            <w:top w:w="0" w:type="dxa"/>
-            <w:bottom w:w="0" w:type="dxa"/>
-          </w:tblCellMar>
-        </w:tblPrEx>
         <w:tc>
           <w:tcPr>
             <w:tcW w:w="3699" w:type="dxa"/>
@@ -14373,12 +13918,6 @@
         </w:tc>
       </w:tr>
       <w:tr>
-        <w:tblPrEx>
-          <w:tblCellMar>
-            <w:top w:w="0" w:type="dxa"/>
-            <w:bottom w:w="0" w:type="dxa"/>
-          </w:tblCellMar>
-        </w:tblPrEx>
         <w:tc>
           <w:tcPr>
             <w:tcW w:w="3699" w:type="dxa"/>
@@ -14451,12 +13990,6 @@
         </w:tc>
       </w:tr>
       <w:tr>
-        <w:tblPrEx>
-          <w:tblCellMar>
-            <w:top w:w="0" w:type="dxa"/>
-            <w:bottom w:w="0" w:type="dxa"/>
-          </w:tblCellMar>
-        </w:tblPrEx>
         <w:tc>
           <w:tcPr>
             <w:tcW w:w="3699" w:type="dxa"/>
@@ -14521,8 +14054,8 @@
       </w:pPr>
     </w:p>
     <w:sectPr>
-      <w:headerReference w:type="default" r:id="rId33"/>
-      <w:footerReference w:type="default" r:id="rId34"/>
+      <w:headerReference w:type="default" r:id="rId34"/>
+      <w:footerReference w:type="default" r:id="rId35"/>
       <w:pgSz w:w="11906" w:h="16838"/>
       <w:pgMar w:top="1020" w:right="1020" w:bottom="1020" w:left="1020" w:header="708" w:footer="708" w:gutter="0"/>
       <w:cols w:space="720"/>
@@ -15674,6 +15207,18 @@
       <w:szCs w:val="20"/>
     </w:rPr>
   </w:style>
+  <w:style w:type="character" w:styleId="UnresolvedMention">
+    <w:name w:val="Unresolved Mention"/>
+    <w:basedOn w:val="DefaultParagraphFont"/>
+    <w:uiPriority w:val="99"/>
+    <w:semiHidden/>
+    <w:unhideWhenUsed/>
+    <w:rsid w:val="00295399"/>
+    <w:rPr>
+      <w:color w:val="605E5C"/>
+      <w:shd w:val="clear" w:color="auto" w:fill="E1DFDD"/>
+    </w:rPr>
+  </w:style>
 </w:styles>
 </file>
 

</xml_diff>